<commit_message>
protocoldigitization, table render  got updated
</commit_message>
<xml_diff>
--- a/app/output.docx
+++ b/app/output.docx
@@ -28035,10 +28035,10 @@
             <v:path o:extrusionok="f" gradientshapeok="t" o:connecttype="rect"/>
             <o:lock v:ext="edit" aspectratio="t"/>
           </v:shapetype>
-          <v:shape id="_x0000_i1025" type="#_x0000_t75" style="width:490pt;height:490.5pt" o:ole="" fillcolor="window">
+          <v:shape id="_x0000_i1025" type="#_x0000_t75" style="width:490.25pt;height:490.25pt" o:ole="" fillcolor="window">
             <v:imagedata r:id="rId24" o:title="" croptop="-442f" cropbottom="18132f" cropright="19895f"/>
           </v:shape>
-          <o:OLEObject Type="Embed" ProgID="Visio.Drawing.11" ShapeID="_x0000_i1025" DrawAspect="Content" ObjectID="_1832939689" r:id="rId25"/>
+          <o:OLEObject Type="Embed" ProgID="Visio.Drawing.11" ShapeID="_x0000_i1025" DrawAspect="Content" ObjectID="_1833105447" r:id="rId25"/>
         </w:object>
       </w:r>
     </w:p>
@@ -35063,7 +35063,6 @@
         <w:rPr>
           <w:lang w:val="en-AU"/>
         </w:rPr>
-        <w:lastRenderedPageBreak/>
         <w:t xml:space="preserve">Listing </w:t>
       </w:r>
       <w:r>
@@ -35175,6 +35174,7 @@
         <w:rPr>
           <w:lang w:val="en-AU"/>
         </w:rPr>
+        <w:lastRenderedPageBreak/>
         <w:t>Narratives</w:t>
       </w:r>
       <w:r>
@@ -35902,7 +35902,6 @@
         <w:pStyle w:val="C-InstructionText"/>
       </w:pPr>
       <w:r>
-        <w:lastRenderedPageBreak/>
         <w:t>The comprehensive analysis of each laboratory parameter is provided in Section 14 and should only be summarized here.</w:t>
       </w:r>
       <w:r>
@@ -36051,6 +36050,7 @@
         <w:pStyle w:val="C-InstructionText"/>
       </w:pPr>
       <w:r>
+        <w:lastRenderedPageBreak/>
         <w:t>For individual subject changes, one or more of the following approaches can be used for selected time intervals:</w:t>
       </w:r>
     </w:p>
@@ -38742,104 +38742,2207 @@
           </w:p>
         </w:tc>
       </w:tr>
+      <w:tr>
+        <w:trPr>
+          <w:cantSplit/>
+          <w:jc w:val="center"/>
+        </w:trPr>
+        <w:tc>
+          <w:tcPr>
+            <w:tcW w:w="1337" w:type="dxa"/>
+          </w:tcPr>
+          <w:p>
+            <w:r>
+              <w:t>Mean</w:t>
+            </w:r>
+          </w:p>
+        </w:tc>
+        <w:tc>
+          <w:tcPr>
+            <w:tcW w:w="1337" w:type="dxa"/>
+          </w:tcPr>
+          <w:p>
+            <w:pPr>
+              <w:jc w:val="center"/>
+            </w:pPr>
+            <w:r>
+              <w:t>67.8</w:t>
+            </w:r>
+          </w:p>
+        </w:tc>
+        <w:tc>
+          <w:tcPr>
+            <w:tcW w:w="1337" w:type="dxa"/>
+          </w:tcPr>
+          <w:p>
+            <w:pPr>
+              <w:jc w:val="center"/>
+            </w:pPr>
+            <w:r>
+              <w:t>44.7</w:t>
+            </w:r>
+          </w:p>
+        </w:tc>
+        <w:tc>
+          <w:tcPr>
+            <w:tcW w:w="1337" w:type="dxa"/>
+          </w:tcPr>
+          <w:p>
+            <w:pPr>
+              <w:jc w:val="center"/>
+            </w:pPr>
+            <w:r>
+              <w:t>60.0</w:t>
+            </w:r>
+          </w:p>
+        </w:tc>
+        <w:tc>
+          <w:tcPr>
+            <w:tcW w:w="1337" w:type="dxa"/>
+          </w:tcPr>
+          <w:p>
+            <w:pPr>
+              <w:jc w:val="center"/>
+            </w:pPr>
+            <w:r>
+              <w:t>42.9</w:t>
+            </w:r>
+          </w:p>
+        </w:tc>
+        <w:tc>
+          <w:tcPr>
+            <w:tcW w:w="1337" w:type="dxa"/>
+          </w:tcPr>
+          <w:p>
+            <w:pPr>
+              <w:jc w:val="center"/>
+            </w:pPr>
+            <w:r>
+              <w:t>47.5</w:t>
+            </w:r>
+          </w:p>
+        </w:tc>
+        <w:tc>
+          <w:tcPr>
+            <w:tcW w:w="1337" w:type="dxa"/>
+          </w:tcPr>
+          <w:p>
+            <w:pPr>
+              <w:jc w:val="center"/>
+            </w:pPr>
+            <w:r>
+              <w:t>51.6</w:t>
+            </w:r>
+          </w:p>
+        </w:tc>
+      </w:tr>
+      <w:tr>
+        <w:trPr>
+          <w:cantSplit/>
+          <w:jc w:val="center"/>
+        </w:trPr>
+        <w:tc>
+          <w:tcPr>
+            <w:tcW w:w="1337" w:type="dxa"/>
+          </w:tcPr>
+          <w:p>
+            <w:r>
+              <w:lastRenderedPageBreak/>
+              <w:t>Standard deviation</w:t>
+            </w:r>
+          </w:p>
+        </w:tc>
+        <w:tc>
+          <w:tcPr>
+            <w:tcW w:w="1337" w:type="dxa"/>
+          </w:tcPr>
+          <w:p>
+            <w:pPr>
+              <w:jc w:val="center"/>
+            </w:pPr>
+            <w:r>
+              <w:t>6.80</w:t>
+            </w:r>
+          </w:p>
+        </w:tc>
+        <w:tc>
+          <w:tcPr>
+            <w:tcW w:w="1337" w:type="dxa"/>
+          </w:tcPr>
+          <w:p>
+            <w:pPr>
+              <w:jc w:val="center"/>
+            </w:pPr>
+            <w:r>
+              <w:t>23.86</w:t>
+            </w:r>
+          </w:p>
+        </w:tc>
+        <w:tc>
+          <w:tcPr>
+            <w:tcW w:w="1337" w:type="dxa"/>
+          </w:tcPr>
+          <w:p>
+            <w:pPr>
+              <w:jc w:val="center"/>
+            </w:pPr>
+            <w:r>
+              <w:t>20.88</w:t>
+            </w:r>
+          </w:p>
+        </w:tc>
+        <w:tc>
+          <w:tcPr>
+            <w:tcW w:w="1337" w:type="dxa"/>
+          </w:tcPr>
+          <w:p>
+            <w:pPr>
+              <w:jc w:val="center"/>
+            </w:pPr>
+            <w:r>
+              <w:t>13.15</w:t>
+            </w:r>
+          </w:p>
+        </w:tc>
+        <w:tc>
+          <w:tcPr>
+            <w:tcW w:w="1337" w:type="dxa"/>
+          </w:tcPr>
+          <w:p>
+            <w:pPr>
+              <w:jc w:val="center"/>
+            </w:pPr>
+            <w:r>
+              <w:t>16.50</w:t>
+            </w:r>
+          </w:p>
+        </w:tc>
+        <w:tc>
+          <w:tcPr>
+            <w:tcW w:w="1337" w:type="dxa"/>
+          </w:tcPr>
+          <w:p>
+            <w:pPr>
+              <w:jc w:val="center"/>
+            </w:pPr>
+            <w:r>
+              <w:t>17.77</w:t>
+            </w:r>
+          </w:p>
+        </w:tc>
+      </w:tr>
+      <w:tr>
+        <w:trPr>
+          <w:cantSplit/>
+          <w:jc w:val="center"/>
+        </w:trPr>
+        <w:tc>
+          <w:tcPr>
+            <w:tcW w:w="1337" w:type="dxa"/>
+          </w:tcPr>
+          <w:p>
+            <w:r>
+              <w:t>Median</w:t>
+            </w:r>
+          </w:p>
+        </w:tc>
+        <w:tc>
+          <w:tcPr>
+            <w:tcW w:w="1337" w:type="dxa"/>
+          </w:tcPr>
+          <w:p>
+            <w:pPr>
+              <w:jc w:val="center"/>
+            </w:pPr>
+            <w:r>
+              <w:t>66.5</w:t>
+            </w:r>
+          </w:p>
+        </w:tc>
+        <w:tc>
+          <w:tcPr>
+            <w:tcW w:w="1337" w:type="dxa"/>
+          </w:tcPr>
+          <w:p>
+            <w:pPr>
+              <w:jc w:val="center"/>
+            </w:pPr>
+            <w:r>
+              <w:t>52.0</w:t>
+            </w:r>
+          </w:p>
+        </w:tc>
+        <w:tc>
+          <w:tcPr>
+            <w:tcW w:w="1337" w:type="dxa"/>
+          </w:tcPr>
+          <w:p>
+            <w:pPr>
+              <w:jc w:val="center"/>
+            </w:pPr>
+            <w:r>
+              <w:t>70.0</w:t>
+            </w:r>
+          </w:p>
+        </w:tc>
+        <w:tc>
+          <w:tcPr>
+            <w:tcW w:w="1337" w:type="dxa"/>
+          </w:tcPr>
+          <w:p>
+            <w:pPr>
+              <w:jc w:val="center"/>
+            </w:pPr>
+            <w:r>
+              <w:t>44.0</w:t>
+            </w:r>
+          </w:p>
+        </w:tc>
+        <w:tc>
+          <w:tcPr>
+            <w:tcW w:w="1337" w:type="dxa"/>
+          </w:tcPr>
+          <w:p>
+            <w:pPr>
+              <w:jc w:val="center"/>
+            </w:pPr>
+            <w:r>
+              <w:t>45.0</w:t>
+            </w:r>
+          </w:p>
+        </w:tc>
+        <w:tc>
+          <w:tcPr>
+            <w:tcW w:w="1337" w:type="dxa"/>
+          </w:tcPr>
+          <w:p>
+            <w:pPr>
+              <w:jc w:val="center"/>
+            </w:pPr>
+            <w:r>
+              <w:t>51.5</w:t>
+            </w:r>
+          </w:p>
+        </w:tc>
+      </w:tr>
+      <w:tr>
+        <w:trPr>
+          <w:cantSplit/>
+          <w:jc w:val="center"/>
+        </w:trPr>
+        <w:tc>
+          <w:tcPr>
+            <w:tcW w:w="1337" w:type="dxa"/>
+          </w:tcPr>
+          <w:p>
+            <w:r>
+              <w:t>Minimum</w:t>
+            </w:r>
+          </w:p>
+        </w:tc>
+        <w:tc>
+          <w:tcPr>
+            <w:tcW w:w="1337" w:type="dxa"/>
+          </w:tcPr>
+          <w:p>
+            <w:pPr>
+              <w:jc w:val="center"/>
+            </w:pPr>
+            <w:r>
+              <w:t>61</w:t>
+            </w:r>
+          </w:p>
+        </w:tc>
+        <w:tc>
+          <w:tcPr>
+            <w:tcW w:w="1337" w:type="dxa"/>
+          </w:tcPr>
+          <w:p>
+            <w:pPr>
+              <w:jc w:val="center"/>
+            </w:pPr>
+            <w:r>
+              <w:t>18</w:t>
+            </w:r>
+          </w:p>
+        </w:tc>
+        <w:tc>
+          <w:tcPr>
+            <w:tcW w:w="1337" w:type="dxa"/>
+          </w:tcPr>
+          <w:p>
+            <w:pPr>
+              <w:jc w:val="center"/>
+            </w:pPr>
+            <w:r>
+              <w:t>36</w:t>
+            </w:r>
+          </w:p>
+        </w:tc>
+        <w:tc>
+          <w:tcPr>
+            <w:tcW w:w="1337" w:type="dxa"/>
+          </w:tcPr>
+          <w:p>
+            <w:pPr>
+              <w:jc w:val="center"/>
+            </w:pPr>
+            <w:r>
+              <w:t>22</w:t>
+            </w:r>
+          </w:p>
+        </w:tc>
+        <w:tc>
+          <w:tcPr>
+            <w:tcW w:w="1337" w:type="dxa"/>
+          </w:tcPr>
+          <w:p>
+            <w:pPr>
+              <w:jc w:val="center"/>
+            </w:pPr>
+            <w:r>
+              <w:t>22</w:t>
+            </w:r>
+          </w:p>
+        </w:tc>
+        <w:tc>
+          <w:tcPr>
+            <w:tcW w:w="1337" w:type="dxa"/>
+          </w:tcPr>
+          <w:p>
+            <w:pPr>
+              <w:jc w:val="center"/>
+            </w:pPr>
+            <w:r>
+              <w:t>18</w:t>
+            </w:r>
+          </w:p>
+        </w:tc>
+      </w:tr>
+      <w:tr>
+        <w:trPr>
+          <w:cantSplit/>
+          <w:jc w:val="center"/>
+        </w:trPr>
+        <w:tc>
+          <w:tcPr>
+            <w:tcW w:w="1337" w:type="dxa"/>
+          </w:tcPr>
+          <w:p>
+            <w:r>
+              <w:t>Maximum</w:t>
+            </w:r>
+          </w:p>
+        </w:tc>
+        <w:tc>
+          <w:tcPr>
+            <w:tcW w:w="1337" w:type="dxa"/>
+          </w:tcPr>
+          <w:p>
+            <w:pPr>
+              <w:jc w:val="center"/>
+            </w:pPr>
+            <w:r>
+              <w:t>77</w:t>
+            </w:r>
+          </w:p>
+        </w:tc>
+        <w:tc>
+          <w:tcPr>
+            <w:tcW w:w="1337" w:type="dxa"/>
+          </w:tcPr>
+          <w:p>
+            <w:pPr>
+              <w:jc w:val="center"/>
+            </w:pPr>
+            <w:r>
+              <w:t>64</w:t>
+            </w:r>
+          </w:p>
+        </w:tc>
+        <w:tc>
+          <w:tcPr>
+            <w:tcW w:w="1337" w:type="dxa"/>
+          </w:tcPr>
+          <w:p>
+            <w:pPr>
+              <w:jc w:val="center"/>
+            </w:pPr>
+            <w:r>
+              <w:t>74</w:t>
+            </w:r>
+          </w:p>
+        </w:tc>
+        <w:tc>
+          <w:tcPr>
+            <w:tcW w:w="1337" w:type="dxa"/>
+          </w:tcPr>
+          <w:p>
+            <w:pPr>
+              <w:jc w:val="center"/>
+            </w:pPr>
+            <w:r>
+              <w:t>66</w:t>
+            </w:r>
+          </w:p>
+        </w:tc>
+        <w:tc>
+          <w:tcPr>
+            <w:tcW w:w="1337" w:type="dxa"/>
+          </w:tcPr>
+          <w:p>
+            <w:pPr>
+              <w:jc w:val="center"/>
+            </w:pPr>
+            <w:r>
+              <w:t>74</w:t>
+            </w:r>
+          </w:p>
+        </w:tc>
+        <w:tc>
+          <w:tcPr>
+            <w:tcW w:w="1337" w:type="dxa"/>
+          </w:tcPr>
+          <w:p>
+            <w:pPr>
+              <w:jc w:val="center"/>
+            </w:pPr>
+            <w:r>
+              <w:t>77</w:t>
+            </w:r>
+          </w:p>
+        </w:tc>
+      </w:tr>
+      <w:tr>
+        <w:trPr>
+          <w:cantSplit/>
+          <w:jc w:val="center"/>
+        </w:trPr>
+        <w:tc>
+          <w:tcPr>
+            <w:tcW w:w="1337" w:type="dxa"/>
+          </w:tcPr>
+          <w:p>
+            <w:r>
+              <w:rPr>
+                <w:b/>
+              </w:rPr>
+              <w:t>Age group, n (%)</w:t>
+            </w:r>
+          </w:p>
+        </w:tc>
+        <w:tc>
+          <w:tcPr>
+            <w:tcW w:w="1337" w:type="dxa"/>
+          </w:tcPr>
+          <w:p>
+            <w:pPr>
+              <w:jc w:val="center"/>
+            </w:pPr>
+          </w:p>
+        </w:tc>
+        <w:tc>
+          <w:tcPr>
+            <w:tcW w:w="1337" w:type="dxa"/>
+          </w:tcPr>
+          <w:p>
+            <w:pPr>
+              <w:jc w:val="center"/>
+            </w:pPr>
+          </w:p>
+        </w:tc>
+        <w:tc>
+          <w:tcPr>
+            <w:tcW w:w="1337" w:type="dxa"/>
+          </w:tcPr>
+          <w:p>
+            <w:pPr>
+              <w:jc w:val="center"/>
+            </w:pPr>
+          </w:p>
+        </w:tc>
+        <w:tc>
+          <w:tcPr>
+            <w:tcW w:w="1337" w:type="dxa"/>
+          </w:tcPr>
+          <w:p>
+            <w:pPr>
+              <w:jc w:val="center"/>
+            </w:pPr>
+          </w:p>
+        </w:tc>
+        <w:tc>
+          <w:tcPr>
+            <w:tcW w:w="1337" w:type="dxa"/>
+          </w:tcPr>
+          <w:p>
+            <w:pPr>
+              <w:jc w:val="center"/>
+            </w:pPr>
+          </w:p>
+        </w:tc>
+        <w:tc>
+          <w:tcPr>
+            <w:tcW w:w="1337" w:type="dxa"/>
+          </w:tcPr>
+          <w:p>
+            <w:pPr>
+              <w:jc w:val="center"/>
+            </w:pPr>
+          </w:p>
+        </w:tc>
+      </w:tr>
+      <w:tr>
+        <w:trPr>
+          <w:cantSplit/>
+          <w:jc w:val="center"/>
+        </w:trPr>
+        <w:tc>
+          <w:tcPr>
+            <w:tcW w:w="1337" w:type="dxa"/>
+          </w:tcPr>
+          <w:p>
+            <w:r>
+              <w:t>Adult</w:t>
+            </w:r>
+          </w:p>
+        </w:tc>
+        <w:tc>
+          <w:tcPr>
+            <w:tcW w:w="1337" w:type="dxa"/>
+          </w:tcPr>
+          <w:p>
+            <w:pPr>
+              <w:jc w:val="center"/>
+            </w:pPr>
+            <w:r>
+              <w:t>4 (100.0)</w:t>
+            </w:r>
+          </w:p>
+        </w:tc>
+        <w:tc>
+          <w:tcPr>
+            <w:tcW w:w="1337" w:type="dxa"/>
+          </w:tcPr>
+          <w:p>
+            <w:pPr>
+              <w:jc w:val="center"/>
+            </w:pPr>
+            <w:r>
+              <w:t>3 (100.0)</w:t>
+            </w:r>
+          </w:p>
+        </w:tc>
+        <w:tc>
+          <w:tcPr>
+            <w:tcW w:w="1337" w:type="dxa"/>
+          </w:tcPr>
+          <w:p>
+            <w:pPr>
+              <w:jc w:val="center"/>
+            </w:pPr>
+            <w:r>
+              <w:t>3 (100.0)</w:t>
+            </w:r>
+          </w:p>
+        </w:tc>
+        <w:tc>
+          <w:tcPr>
+            <w:tcW w:w="1337" w:type="dxa"/>
+          </w:tcPr>
+          <w:p>
+            <w:pPr>
+              <w:jc w:val="center"/>
+            </w:pPr>
+            <w:r>
+              <w:t>8 (100.0)</w:t>
+            </w:r>
+          </w:p>
+        </w:tc>
+        <w:tc>
+          <w:tcPr>
+            <w:tcW w:w="1337" w:type="dxa"/>
+          </w:tcPr>
+          <w:p>
+            <w:pPr>
+              <w:jc w:val="center"/>
+            </w:pPr>
+            <w:r>
+              <w:t>11 (100.0)</w:t>
+            </w:r>
+          </w:p>
+        </w:tc>
+        <w:tc>
+          <w:tcPr>
+            <w:tcW w:w="1337" w:type="dxa"/>
+          </w:tcPr>
+          <w:p>
+            <w:pPr>
+              <w:jc w:val="center"/>
+            </w:pPr>
+            <w:r>
+              <w:t>18 (100.0)</w:t>
+            </w:r>
+          </w:p>
+        </w:tc>
+      </w:tr>
+      <w:tr>
+        <w:trPr>
+          <w:cantSplit/>
+          <w:jc w:val="center"/>
+        </w:trPr>
+        <w:tc>
+          <w:tcPr>
+            <w:tcW w:w="1337" w:type="dxa"/>
+          </w:tcPr>
+          <w:p>
+            <w:r>
+              <w:t>Pediatric</w:t>
+            </w:r>
+          </w:p>
+        </w:tc>
+        <w:tc>
+          <w:tcPr>
+            <w:tcW w:w="1337" w:type="dxa"/>
+          </w:tcPr>
+          <w:p>
+            <w:pPr>
+              <w:jc w:val="center"/>
+            </w:pPr>
+            <w:r>
+              <w:t>0 ( 0.0)</w:t>
+            </w:r>
+          </w:p>
+        </w:tc>
+        <w:tc>
+          <w:tcPr>
+            <w:tcW w:w="1337" w:type="dxa"/>
+          </w:tcPr>
+          <w:p>
+            <w:pPr>
+              <w:jc w:val="center"/>
+            </w:pPr>
+            <w:r>
+              <w:t>0 ( 0.0)</w:t>
+            </w:r>
+          </w:p>
+        </w:tc>
+        <w:tc>
+          <w:tcPr>
+            <w:tcW w:w="1337" w:type="dxa"/>
+          </w:tcPr>
+          <w:p>
+            <w:pPr>
+              <w:jc w:val="center"/>
+            </w:pPr>
+            <w:r>
+              <w:t>0 ( 0.0)</w:t>
+            </w:r>
+          </w:p>
+        </w:tc>
+        <w:tc>
+          <w:tcPr>
+            <w:tcW w:w="1337" w:type="dxa"/>
+          </w:tcPr>
+          <w:p>
+            <w:pPr>
+              <w:jc w:val="center"/>
+            </w:pPr>
+            <w:r>
+              <w:t>0 ( 0.0)</w:t>
+            </w:r>
+          </w:p>
+        </w:tc>
+        <w:tc>
+          <w:tcPr>
+            <w:tcW w:w="1337" w:type="dxa"/>
+          </w:tcPr>
+          <w:p>
+            <w:pPr>
+              <w:jc w:val="center"/>
+            </w:pPr>
+            <w:r>
+              <w:t>0 ( 0.0)</w:t>
+            </w:r>
+          </w:p>
+        </w:tc>
+        <w:tc>
+          <w:tcPr>
+            <w:tcW w:w="1337" w:type="dxa"/>
+          </w:tcPr>
+          <w:p>
+            <w:pPr>
+              <w:jc w:val="center"/>
+            </w:pPr>
+            <w:r>
+              <w:t>0 ( 0.0)</w:t>
+            </w:r>
+          </w:p>
+        </w:tc>
+      </w:tr>
+      <w:tr>
+        <w:trPr>
+          <w:cantSplit/>
+          <w:jc w:val="center"/>
+        </w:trPr>
+        <w:tc>
+          <w:tcPr>
+            <w:tcW w:w="1337" w:type="dxa"/>
+          </w:tcPr>
+          <w:p>
+            <w:r>
+              <w:rPr>
+                <w:b/>
+              </w:rPr>
+              <w:t>Sex, n (%)</w:t>
+            </w:r>
+          </w:p>
+        </w:tc>
+        <w:tc>
+          <w:tcPr>
+            <w:tcW w:w="1337" w:type="dxa"/>
+          </w:tcPr>
+          <w:p>
+            <w:pPr>
+              <w:jc w:val="center"/>
+            </w:pPr>
+          </w:p>
+        </w:tc>
+        <w:tc>
+          <w:tcPr>
+            <w:tcW w:w="1337" w:type="dxa"/>
+          </w:tcPr>
+          <w:p>
+            <w:pPr>
+              <w:jc w:val="center"/>
+            </w:pPr>
+          </w:p>
+        </w:tc>
+        <w:tc>
+          <w:tcPr>
+            <w:tcW w:w="1337" w:type="dxa"/>
+          </w:tcPr>
+          <w:p>
+            <w:pPr>
+              <w:jc w:val="center"/>
+            </w:pPr>
+          </w:p>
+        </w:tc>
+        <w:tc>
+          <w:tcPr>
+            <w:tcW w:w="1337" w:type="dxa"/>
+          </w:tcPr>
+          <w:p>
+            <w:pPr>
+              <w:jc w:val="center"/>
+            </w:pPr>
+          </w:p>
+        </w:tc>
+        <w:tc>
+          <w:tcPr>
+            <w:tcW w:w="1337" w:type="dxa"/>
+          </w:tcPr>
+          <w:p>
+            <w:pPr>
+              <w:jc w:val="center"/>
+            </w:pPr>
+          </w:p>
+        </w:tc>
+        <w:tc>
+          <w:tcPr>
+            <w:tcW w:w="1337" w:type="dxa"/>
+          </w:tcPr>
+          <w:p>
+            <w:pPr>
+              <w:jc w:val="center"/>
+            </w:pPr>
+          </w:p>
+        </w:tc>
+      </w:tr>
+      <w:tr>
+        <w:trPr>
+          <w:cantSplit/>
+          <w:jc w:val="center"/>
+        </w:trPr>
+        <w:tc>
+          <w:tcPr>
+            <w:tcW w:w="1337" w:type="dxa"/>
+          </w:tcPr>
+          <w:p>
+            <w:r>
+              <w:t>Male</w:t>
+            </w:r>
+          </w:p>
+        </w:tc>
+        <w:tc>
+          <w:tcPr>
+            <w:tcW w:w="1337" w:type="dxa"/>
+          </w:tcPr>
+          <w:p>
+            <w:pPr>
+              <w:jc w:val="center"/>
+            </w:pPr>
+            <w:r>
+              <w:t>2 ( 50.0)</w:t>
+            </w:r>
+          </w:p>
+        </w:tc>
+        <w:tc>
+          <w:tcPr>
+            <w:tcW w:w="1337" w:type="dxa"/>
+          </w:tcPr>
+          <w:p>
+            <w:pPr>
+              <w:jc w:val="center"/>
+            </w:pPr>
+            <w:r>
+              <w:t>1 ( 33.3)</w:t>
+            </w:r>
+          </w:p>
+        </w:tc>
+        <w:tc>
+          <w:tcPr>
+            <w:tcW w:w="1337" w:type="dxa"/>
+          </w:tcPr>
+          <w:p>
+            <w:pPr>
+              <w:jc w:val="center"/>
+            </w:pPr>
+            <w:r>
+              <w:t>1 ( 33.3)</w:t>
+            </w:r>
+          </w:p>
+        </w:tc>
+        <w:tc>
+          <w:tcPr>
+            <w:tcW w:w="1337" w:type="dxa"/>
+          </w:tcPr>
+          <w:p>
+            <w:pPr>
+              <w:jc w:val="center"/>
+            </w:pPr>
+            <w:r>
+              <w:t>7 ( 87.5)</w:t>
+            </w:r>
+          </w:p>
+        </w:tc>
+        <w:tc>
+          <w:tcPr>
+            <w:tcW w:w="1337" w:type="dxa"/>
+          </w:tcPr>
+          <w:p>
+            <w:pPr>
+              <w:jc w:val="center"/>
+            </w:pPr>
+            <w:r>
+              <w:t>8 ( 72.7)</w:t>
+            </w:r>
+          </w:p>
+        </w:tc>
+        <w:tc>
+          <w:tcPr>
+            <w:tcW w:w="1337" w:type="dxa"/>
+          </w:tcPr>
+          <w:p>
+            <w:pPr>
+              <w:jc w:val="center"/>
+            </w:pPr>
+            <w:r>
+              <w:t>11 ( 61.1)</w:t>
+            </w:r>
+          </w:p>
+        </w:tc>
+      </w:tr>
+      <w:tr>
+        <w:trPr>
+          <w:cantSplit/>
+          <w:jc w:val="center"/>
+        </w:trPr>
+        <w:tc>
+          <w:tcPr>
+            <w:tcW w:w="1337" w:type="dxa"/>
+          </w:tcPr>
+          <w:p>
+            <w:r>
+              <w:t>Female</w:t>
+            </w:r>
+          </w:p>
+        </w:tc>
+        <w:tc>
+          <w:tcPr>
+            <w:tcW w:w="1337" w:type="dxa"/>
+          </w:tcPr>
+          <w:p>
+            <w:pPr>
+              <w:jc w:val="center"/>
+            </w:pPr>
+            <w:r>
+              <w:t>2 ( 50.0)</w:t>
+            </w:r>
+          </w:p>
+        </w:tc>
+        <w:tc>
+          <w:tcPr>
+            <w:tcW w:w="1337" w:type="dxa"/>
+          </w:tcPr>
+          <w:p>
+            <w:pPr>
+              <w:jc w:val="center"/>
+            </w:pPr>
+            <w:r>
+              <w:t>2 ( 66.7)</w:t>
+            </w:r>
+          </w:p>
+        </w:tc>
+        <w:tc>
+          <w:tcPr>
+            <w:tcW w:w="1337" w:type="dxa"/>
+          </w:tcPr>
+          <w:p>
+            <w:pPr>
+              <w:jc w:val="center"/>
+            </w:pPr>
+            <w:r>
+              <w:t>2 ( 66.7)</w:t>
+            </w:r>
+          </w:p>
+        </w:tc>
+        <w:tc>
+          <w:tcPr>
+            <w:tcW w:w="1337" w:type="dxa"/>
+          </w:tcPr>
+          <w:p>
+            <w:pPr>
+              <w:jc w:val="center"/>
+            </w:pPr>
+            <w:r>
+              <w:t>1 ( 12.5)</w:t>
+            </w:r>
+          </w:p>
+        </w:tc>
+        <w:tc>
+          <w:tcPr>
+            <w:tcW w:w="1337" w:type="dxa"/>
+          </w:tcPr>
+          <w:p>
+            <w:pPr>
+              <w:jc w:val="center"/>
+            </w:pPr>
+            <w:r>
+              <w:t>3 ( 27.3)</w:t>
+            </w:r>
+          </w:p>
+        </w:tc>
+        <w:tc>
+          <w:tcPr>
+            <w:tcW w:w="1337" w:type="dxa"/>
+          </w:tcPr>
+          <w:p>
+            <w:pPr>
+              <w:jc w:val="center"/>
+            </w:pPr>
+            <w:r>
+              <w:t>7 ( 38.9)</w:t>
+            </w:r>
+          </w:p>
+        </w:tc>
+      </w:tr>
+      <w:tr>
+        <w:trPr>
+          <w:cantSplit/>
+          <w:jc w:val="center"/>
+        </w:trPr>
+        <w:tc>
+          <w:tcPr>
+            <w:tcW w:w="1337" w:type="dxa"/>
+          </w:tcPr>
+          <w:p>
+            <w:r>
+              <w:t>Female</w:t>
+            </w:r>
+          </w:p>
+        </w:tc>
+        <w:tc>
+          <w:tcPr>
+            <w:tcW w:w="1337" w:type="dxa"/>
+          </w:tcPr>
+          <w:p>
+            <w:pPr>
+              <w:jc w:val="center"/>
+            </w:pPr>
+            <w:r>
+              <w:t>2 ( 50.0)</w:t>
+            </w:r>
+          </w:p>
+        </w:tc>
+        <w:tc>
+          <w:tcPr>
+            <w:tcW w:w="1337" w:type="dxa"/>
+          </w:tcPr>
+          <w:p>
+            <w:pPr>
+              <w:jc w:val="center"/>
+            </w:pPr>
+            <w:r>
+              <w:t>2 ( 66.7)</w:t>
+            </w:r>
+          </w:p>
+        </w:tc>
+        <w:tc>
+          <w:tcPr>
+            <w:tcW w:w="1337" w:type="dxa"/>
+          </w:tcPr>
+          <w:p>
+            <w:pPr>
+              <w:jc w:val="center"/>
+            </w:pPr>
+            <w:r>
+              <w:t>2 ( 66.7)</w:t>
+            </w:r>
+          </w:p>
+        </w:tc>
+        <w:tc>
+          <w:tcPr>
+            <w:tcW w:w="1337" w:type="dxa"/>
+          </w:tcPr>
+          <w:p>
+            <w:pPr>
+              <w:jc w:val="center"/>
+            </w:pPr>
+            <w:r>
+              <w:t>1 ( 12.5)</w:t>
+            </w:r>
+          </w:p>
+        </w:tc>
+        <w:tc>
+          <w:tcPr>
+            <w:tcW w:w="1337" w:type="dxa"/>
+          </w:tcPr>
+          <w:p>
+            <w:pPr>
+              <w:jc w:val="center"/>
+            </w:pPr>
+            <w:r>
+              <w:t>3 ( 27.3)</w:t>
+            </w:r>
+          </w:p>
+        </w:tc>
+        <w:tc>
+          <w:tcPr>
+            <w:tcW w:w="1337" w:type="dxa"/>
+          </w:tcPr>
+          <w:p>
+            <w:pPr>
+              <w:jc w:val="center"/>
+            </w:pPr>
+            <w:r>
+              <w:t>7 ( 38.9)</w:t>
+            </w:r>
+          </w:p>
+        </w:tc>
+      </w:tr>
+      <w:tr>
+        <w:trPr>
+          <w:cantSplit/>
+          <w:jc w:val="center"/>
+        </w:trPr>
+        <w:tc>
+          <w:tcPr>
+            <w:tcW w:w="1337" w:type="dxa"/>
+          </w:tcPr>
+          <w:p>
+            <w:r>
+              <w:t>Mean</w:t>
+            </w:r>
+          </w:p>
+        </w:tc>
+        <w:tc>
+          <w:tcPr>
+            <w:tcW w:w="1337" w:type="dxa"/>
+          </w:tcPr>
+          <w:p>
+            <w:pPr>
+              <w:jc w:val="center"/>
+            </w:pPr>
+            <w:r>
+              <w:t>67.8</w:t>
+            </w:r>
+          </w:p>
+        </w:tc>
+        <w:tc>
+          <w:tcPr>
+            <w:tcW w:w="1337" w:type="dxa"/>
+          </w:tcPr>
+          <w:p>
+            <w:pPr>
+              <w:jc w:val="center"/>
+            </w:pPr>
+            <w:r>
+              <w:t>44.7</w:t>
+            </w:r>
+          </w:p>
+        </w:tc>
+        <w:tc>
+          <w:tcPr>
+            <w:tcW w:w="1337" w:type="dxa"/>
+          </w:tcPr>
+          <w:p>
+            <w:pPr>
+              <w:jc w:val="center"/>
+            </w:pPr>
+            <w:r>
+              <w:t>60.0</w:t>
+            </w:r>
+          </w:p>
+        </w:tc>
+        <w:tc>
+          <w:tcPr>
+            <w:tcW w:w="1337" w:type="dxa"/>
+          </w:tcPr>
+          <w:p>
+            <w:pPr>
+              <w:jc w:val="center"/>
+            </w:pPr>
+            <w:r>
+              <w:t>42.9</w:t>
+            </w:r>
+          </w:p>
+        </w:tc>
+        <w:tc>
+          <w:tcPr>
+            <w:tcW w:w="1337" w:type="dxa"/>
+          </w:tcPr>
+          <w:p>
+            <w:pPr>
+              <w:jc w:val="center"/>
+            </w:pPr>
+            <w:r>
+              <w:t>47.5</w:t>
+            </w:r>
+          </w:p>
+        </w:tc>
+        <w:tc>
+          <w:tcPr>
+            <w:tcW w:w="1337" w:type="dxa"/>
+          </w:tcPr>
+          <w:p>
+            <w:pPr>
+              <w:jc w:val="center"/>
+            </w:pPr>
+            <w:r>
+              <w:t>51.6</w:t>
+            </w:r>
+          </w:p>
+        </w:tc>
+      </w:tr>
+      <w:tr>
+        <w:trPr>
+          <w:cantSplit/>
+          <w:jc w:val="center"/>
+        </w:trPr>
+        <w:tc>
+          <w:tcPr>
+            <w:tcW w:w="1337" w:type="dxa"/>
+          </w:tcPr>
+          <w:p>
+            <w:r>
+              <w:t>Standard deviation</w:t>
+            </w:r>
+          </w:p>
+        </w:tc>
+        <w:tc>
+          <w:tcPr>
+            <w:tcW w:w="1337" w:type="dxa"/>
+          </w:tcPr>
+          <w:p>
+            <w:pPr>
+              <w:jc w:val="center"/>
+            </w:pPr>
+            <w:r>
+              <w:t>6.80</w:t>
+            </w:r>
+          </w:p>
+        </w:tc>
+        <w:tc>
+          <w:tcPr>
+            <w:tcW w:w="1337" w:type="dxa"/>
+          </w:tcPr>
+          <w:p>
+            <w:pPr>
+              <w:jc w:val="center"/>
+            </w:pPr>
+            <w:r>
+              <w:t>23.86</w:t>
+            </w:r>
+          </w:p>
+        </w:tc>
+        <w:tc>
+          <w:tcPr>
+            <w:tcW w:w="1337" w:type="dxa"/>
+          </w:tcPr>
+          <w:p>
+            <w:pPr>
+              <w:jc w:val="center"/>
+            </w:pPr>
+            <w:r>
+              <w:t>20.88</w:t>
+            </w:r>
+          </w:p>
+        </w:tc>
+        <w:tc>
+          <w:tcPr>
+            <w:tcW w:w="1337" w:type="dxa"/>
+          </w:tcPr>
+          <w:p>
+            <w:pPr>
+              <w:jc w:val="center"/>
+            </w:pPr>
+            <w:r>
+              <w:t>13.15</w:t>
+            </w:r>
+          </w:p>
+        </w:tc>
+        <w:tc>
+          <w:tcPr>
+            <w:tcW w:w="1337" w:type="dxa"/>
+          </w:tcPr>
+          <w:p>
+            <w:pPr>
+              <w:jc w:val="center"/>
+            </w:pPr>
+            <w:r>
+              <w:t>16.50</w:t>
+            </w:r>
+          </w:p>
+        </w:tc>
+        <w:tc>
+          <w:tcPr>
+            <w:tcW w:w="1337" w:type="dxa"/>
+          </w:tcPr>
+          <w:p>
+            <w:pPr>
+              <w:jc w:val="center"/>
+            </w:pPr>
+            <w:r>
+              <w:t>17.77</w:t>
+            </w:r>
+          </w:p>
+        </w:tc>
+      </w:tr>
+      <w:tr>
+        <w:trPr>
+          <w:cantSplit/>
+          <w:jc w:val="center"/>
+        </w:trPr>
+        <w:tc>
+          <w:tcPr>
+            <w:tcW w:w="1337" w:type="dxa"/>
+          </w:tcPr>
+          <w:p>
+            <w:r>
+              <w:t>Median</w:t>
+            </w:r>
+          </w:p>
+        </w:tc>
+        <w:tc>
+          <w:tcPr>
+            <w:tcW w:w="1337" w:type="dxa"/>
+          </w:tcPr>
+          <w:p>
+            <w:pPr>
+              <w:jc w:val="center"/>
+            </w:pPr>
+            <w:r>
+              <w:t>66.5</w:t>
+            </w:r>
+          </w:p>
+        </w:tc>
+        <w:tc>
+          <w:tcPr>
+            <w:tcW w:w="1337" w:type="dxa"/>
+          </w:tcPr>
+          <w:p>
+            <w:pPr>
+              <w:jc w:val="center"/>
+            </w:pPr>
+            <w:r>
+              <w:t>52.0</w:t>
+            </w:r>
+          </w:p>
+        </w:tc>
+        <w:tc>
+          <w:tcPr>
+            <w:tcW w:w="1337" w:type="dxa"/>
+          </w:tcPr>
+          <w:p>
+            <w:pPr>
+              <w:jc w:val="center"/>
+            </w:pPr>
+            <w:r>
+              <w:t>70.0</w:t>
+            </w:r>
+          </w:p>
+        </w:tc>
+        <w:tc>
+          <w:tcPr>
+            <w:tcW w:w="1337" w:type="dxa"/>
+          </w:tcPr>
+          <w:p>
+            <w:pPr>
+              <w:jc w:val="center"/>
+            </w:pPr>
+            <w:r>
+              <w:t>44.0</w:t>
+            </w:r>
+          </w:p>
+        </w:tc>
+        <w:tc>
+          <w:tcPr>
+            <w:tcW w:w="1337" w:type="dxa"/>
+          </w:tcPr>
+          <w:p>
+            <w:pPr>
+              <w:jc w:val="center"/>
+            </w:pPr>
+            <w:r>
+              <w:t>45.0</w:t>
+            </w:r>
+          </w:p>
+        </w:tc>
+        <w:tc>
+          <w:tcPr>
+            <w:tcW w:w="1337" w:type="dxa"/>
+          </w:tcPr>
+          <w:p>
+            <w:pPr>
+              <w:jc w:val="center"/>
+            </w:pPr>
+            <w:r>
+              <w:t>51.5</w:t>
+            </w:r>
+          </w:p>
+        </w:tc>
+      </w:tr>
+      <w:tr>
+        <w:trPr>
+          <w:cantSplit/>
+          <w:jc w:val="center"/>
+        </w:trPr>
+        <w:tc>
+          <w:tcPr>
+            <w:tcW w:w="1337" w:type="dxa"/>
+          </w:tcPr>
+          <w:p>
+            <w:r>
+              <w:t>Minimum</w:t>
+            </w:r>
+          </w:p>
+        </w:tc>
+        <w:tc>
+          <w:tcPr>
+            <w:tcW w:w="1337" w:type="dxa"/>
+          </w:tcPr>
+          <w:p>
+            <w:pPr>
+              <w:jc w:val="center"/>
+            </w:pPr>
+            <w:r>
+              <w:t>61</w:t>
+            </w:r>
+          </w:p>
+        </w:tc>
+        <w:tc>
+          <w:tcPr>
+            <w:tcW w:w="1337" w:type="dxa"/>
+          </w:tcPr>
+          <w:p>
+            <w:pPr>
+              <w:jc w:val="center"/>
+            </w:pPr>
+            <w:r>
+              <w:t>18</w:t>
+            </w:r>
+          </w:p>
+        </w:tc>
+        <w:tc>
+          <w:tcPr>
+            <w:tcW w:w="1337" w:type="dxa"/>
+          </w:tcPr>
+          <w:p>
+            <w:pPr>
+              <w:jc w:val="center"/>
+            </w:pPr>
+            <w:r>
+              <w:t>36</w:t>
+            </w:r>
+          </w:p>
+        </w:tc>
+        <w:tc>
+          <w:tcPr>
+            <w:tcW w:w="1337" w:type="dxa"/>
+          </w:tcPr>
+          <w:p>
+            <w:pPr>
+              <w:jc w:val="center"/>
+            </w:pPr>
+            <w:r>
+              <w:t>22</w:t>
+            </w:r>
+          </w:p>
+        </w:tc>
+        <w:tc>
+          <w:tcPr>
+            <w:tcW w:w="1337" w:type="dxa"/>
+          </w:tcPr>
+          <w:p>
+            <w:pPr>
+              <w:jc w:val="center"/>
+            </w:pPr>
+            <w:r>
+              <w:t>22</w:t>
+            </w:r>
+          </w:p>
+        </w:tc>
+        <w:tc>
+          <w:tcPr>
+            <w:tcW w:w="1337" w:type="dxa"/>
+          </w:tcPr>
+          <w:p>
+            <w:pPr>
+              <w:jc w:val="center"/>
+            </w:pPr>
+            <w:r>
+              <w:t>18</w:t>
+            </w:r>
+          </w:p>
+        </w:tc>
+      </w:tr>
+      <w:tr>
+        <w:trPr>
+          <w:cantSplit/>
+          <w:jc w:val="center"/>
+        </w:trPr>
+        <w:tc>
+          <w:tcPr>
+            <w:tcW w:w="1337" w:type="dxa"/>
+          </w:tcPr>
+          <w:p>
+            <w:r>
+              <w:t>Maximum</w:t>
+            </w:r>
+          </w:p>
+        </w:tc>
+        <w:tc>
+          <w:tcPr>
+            <w:tcW w:w="1337" w:type="dxa"/>
+          </w:tcPr>
+          <w:p>
+            <w:pPr>
+              <w:jc w:val="center"/>
+            </w:pPr>
+            <w:r>
+              <w:t>77</w:t>
+            </w:r>
+          </w:p>
+        </w:tc>
+        <w:tc>
+          <w:tcPr>
+            <w:tcW w:w="1337" w:type="dxa"/>
+          </w:tcPr>
+          <w:p>
+            <w:pPr>
+              <w:jc w:val="center"/>
+            </w:pPr>
+            <w:r>
+              <w:t>64</w:t>
+            </w:r>
+          </w:p>
+        </w:tc>
+        <w:tc>
+          <w:tcPr>
+            <w:tcW w:w="1337" w:type="dxa"/>
+          </w:tcPr>
+          <w:p>
+            <w:pPr>
+              <w:jc w:val="center"/>
+            </w:pPr>
+            <w:r>
+              <w:t>74</w:t>
+            </w:r>
+          </w:p>
+        </w:tc>
+        <w:tc>
+          <w:tcPr>
+            <w:tcW w:w="1337" w:type="dxa"/>
+          </w:tcPr>
+          <w:p>
+            <w:pPr>
+              <w:jc w:val="center"/>
+            </w:pPr>
+            <w:r>
+              <w:t>66</w:t>
+            </w:r>
+          </w:p>
+        </w:tc>
+        <w:tc>
+          <w:tcPr>
+            <w:tcW w:w="1337" w:type="dxa"/>
+          </w:tcPr>
+          <w:p>
+            <w:pPr>
+              <w:jc w:val="center"/>
+            </w:pPr>
+            <w:r>
+              <w:t>74</w:t>
+            </w:r>
+          </w:p>
+        </w:tc>
+        <w:tc>
+          <w:tcPr>
+            <w:tcW w:w="1337" w:type="dxa"/>
+          </w:tcPr>
+          <w:p>
+            <w:pPr>
+              <w:jc w:val="center"/>
+            </w:pPr>
+            <w:r>
+              <w:t>77</w:t>
+            </w:r>
+          </w:p>
+        </w:tc>
+      </w:tr>
+      <w:tr>
+        <w:trPr>
+          <w:cantSplit/>
+          <w:jc w:val="center"/>
+        </w:trPr>
+        <w:tc>
+          <w:tcPr>
+            <w:tcW w:w="1337" w:type="dxa"/>
+          </w:tcPr>
+          <w:p>
+            <w:r>
+              <w:rPr>
+                <w:b/>
+              </w:rPr>
+              <w:t>Age group, n (%)</w:t>
+            </w:r>
+          </w:p>
+        </w:tc>
+        <w:tc>
+          <w:tcPr>
+            <w:tcW w:w="1337" w:type="dxa"/>
+          </w:tcPr>
+          <w:p>
+            <w:pPr>
+              <w:jc w:val="center"/>
+            </w:pPr>
+          </w:p>
+        </w:tc>
+        <w:tc>
+          <w:tcPr>
+            <w:tcW w:w="1337" w:type="dxa"/>
+          </w:tcPr>
+          <w:p>
+            <w:pPr>
+              <w:jc w:val="center"/>
+            </w:pPr>
+          </w:p>
+        </w:tc>
+        <w:tc>
+          <w:tcPr>
+            <w:tcW w:w="1337" w:type="dxa"/>
+          </w:tcPr>
+          <w:p>
+            <w:pPr>
+              <w:jc w:val="center"/>
+            </w:pPr>
+          </w:p>
+        </w:tc>
+        <w:tc>
+          <w:tcPr>
+            <w:tcW w:w="1337" w:type="dxa"/>
+          </w:tcPr>
+          <w:p>
+            <w:pPr>
+              <w:jc w:val="center"/>
+            </w:pPr>
+          </w:p>
+        </w:tc>
+        <w:tc>
+          <w:tcPr>
+            <w:tcW w:w="1337" w:type="dxa"/>
+          </w:tcPr>
+          <w:p>
+            <w:pPr>
+              <w:jc w:val="center"/>
+            </w:pPr>
+          </w:p>
+        </w:tc>
+        <w:tc>
+          <w:tcPr>
+            <w:tcW w:w="1337" w:type="dxa"/>
+          </w:tcPr>
+          <w:p>
+            <w:pPr>
+              <w:jc w:val="center"/>
+            </w:pPr>
+          </w:p>
+        </w:tc>
+      </w:tr>
+      <w:tr>
+        <w:trPr>
+          <w:cantSplit/>
+          <w:jc w:val="center"/>
+        </w:trPr>
+        <w:tc>
+          <w:tcPr>
+            <w:tcW w:w="1337" w:type="dxa"/>
+          </w:tcPr>
+          <w:p>
+            <w:r>
+              <w:t>Adult</w:t>
+            </w:r>
+          </w:p>
+        </w:tc>
+        <w:tc>
+          <w:tcPr>
+            <w:tcW w:w="1337" w:type="dxa"/>
+          </w:tcPr>
+          <w:p>
+            <w:pPr>
+              <w:jc w:val="center"/>
+            </w:pPr>
+            <w:r>
+              <w:t>4 (100.0)</w:t>
+            </w:r>
+          </w:p>
+        </w:tc>
+        <w:tc>
+          <w:tcPr>
+            <w:tcW w:w="1337" w:type="dxa"/>
+          </w:tcPr>
+          <w:p>
+            <w:pPr>
+              <w:jc w:val="center"/>
+            </w:pPr>
+            <w:r>
+              <w:t>3 (100.0)</w:t>
+            </w:r>
+          </w:p>
+        </w:tc>
+        <w:tc>
+          <w:tcPr>
+            <w:tcW w:w="1337" w:type="dxa"/>
+          </w:tcPr>
+          <w:p>
+            <w:pPr>
+              <w:jc w:val="center"/>
+            </w:pPr>
+            <w:r>
+              <w:t>3 (100.0)</w:t>
+            </w:r>
+          </w:p>
+        </w:tc>
+        <w:tc>
+          <w:tcPr>
+            <w:tcW w:w="1337" w:type="dxa"/>
+          </w:tcPr>
+          <w:p>
+            <w:pPr>
+              <w:jc w:val="center"/>
+            </w:pPr>
+            <w:r>
+              <w:t>8 (100.0)</w:t>
+            </w:r>
+          </w:p>
+        </w:tc>
+        <w:tc>
+          <w:tcPr>
+            <w:tcW w:w="1337" w:type="dxa"/>
+          </w:tcPr>
+          <w:p>
+            <w:pPr>
+              <w:jc w:val="center"/>
+            </w:pPr>
+            <w:r>
+              <w:t>11 (100.0)</w:t>
+            </w:r>
+          </w:p>
+        </w:tc>
+        <w:tc>
+          <w:tcPr>
+            <w:tcW w:w="1337" w:type="dxa"/>
+          </w:tcPr>
+          <w:p>
+            <w:pPr>
+              <w:jc w:val="center"/>
+            </w:pPr>
+            <w:r>
+              <w:t>18 (100.0)</w:t>
+            </w:r>
+          </w:p>
+        </w:tc>
+      </w:tr>
+      <w:tr>
+        <w:trPr>
+          <w:cantSplit/>
+          <w:jc w:val="center"/>
+        </w:trPr>
+        <w:tc>
+          <w:tcPr>
+            <w:tcW w:w="1337" w:type="dxa"/>
+          </w:tcPr>
+          <w:p>
+            <w:r>
+              <w:t>Pediatric</w:t>
+            </w:r>
+          </w:p>
+        </w:tc>
+        <w:tc>
+          <w:tcPr>
+            <w:tcW w:w="1337" w:type="dxa"/>
+          </w:tcPr>
+          <w:p>
+            <w:pPr>
+              <w:jc w:val="center"/>
+            </w:pPr>
+            <w:r>
+              <w:t>0 ( 0.0)</w:t>
+            </w:r>
+          </w:p>
+        </w:tc>
+        <w:tc>
+          <w:tcPr>
+            <w:tcW w:w="1337" w:type="dxa"/>
+          </w:tcPr>
+          <w:p>
+            <w:pPr>
+              <w:jc w:val="center"/>
+            </w:pPr>
+            <w:r>
+              <w:t>0 ( 0.0)</w:t>
+            </w:r>
+          </w:p>
+        </w:tc>
+        <w:tc>
+          <w:tcPr>
+            <w:tcW w:w="1337" w:type="dxa"/>
+          </w:tcPr>
+          <w:p>
+            <w:pPr>
+              <w:jc w:val="center"/>
+            </w:pPr>
+            <w:r>
+              <w:t>0 ( 0.0)</w:t>
+            </w:r>
+          </w:p>
+        </w:tc>
+        <w:tc>
+          <w:tcPr>
+            <w:tcW w:w="1337" w:type="dxa"/>
+          </w:tcPr>
+          <w:p>
+            <w:pPr>
+              <w:jc w:val="center"/>
+            </w:pPr>
+            <w:r>
+              <w:t>0 ( 0.0)</w:t>
+            </w:r>
+          </w:p>
+        </w:tc>
+        <w:tc>
+          <w:tcPr>
+            <w:tcW w:w="1337" w:type="dxa"/>
+          </w:tcPr>
+          <w:p>
+            <w:pPr>
+              <w:jc w:val="center"/>
+            </w:pPr>
+            <w:r>
+              <w:t>0 ( 0.0)</w:t>
+            </w:r>
+          </w:p>
+        </w:tc>
+        <w:tc>
+          <w:tcPr>
+            <w:tcW w:w="1337" w:type="dxa"/>
+          </w:tcPr>
+          <w:p>
+            <w:pPr>
+              <w:jc w:val="center"/>
+            </w:pPr>
+            <w:r>
+              <w:t>0 ( 0.0)</w:t>
+            </w:r>
+          </w:p>
+        </w:tc>
+      </w:tr>
+      <w:tr>
+        <w:trPr>
+          <w:cantSplit/>
+          <w:jc w:val="center"/>
+        </w:trPr>
+        <w:tc>
+          <w:tcPr>
+            <w:tcW w:w="1337" w:type="dxa"/>
+          </w:tcPr>
+          <w:p>
+            <w:r>
+              <w:rPr>
+                <w:b/>
+              </w:rPr>
+              <w:t>Sex, n (%)</w:t>
+            </w:r>
+          </w:p>
+        </w:tc>
+        <w:tc>
+          <w:tcPr>
+            <w:tcW w:w="1337" w:type="dxa"/>
+          </w:tcPr>
+          <w:p>
+            <w:pPr>
+              <w:jc w:val="center"/>
+            </w:pPr>
+          </w:p>
+        </w:tc>
+        <w:tc>
+          <w:tcPr>
+            <w:tcW w:w="1337" w:type="dxa"/>
+          </w:tcPr>
+          <w:p>
+            <w:pPr>
+              <w:jc w:val="center"/>
+            </w:pPr>
+          </w:p>
+        </w:tc>
+        <w:tc>
+          <w:tcPr>
+            <w:tcW w:w="1337" w:type="dxa"/>
+          </w:tcPr>
+          <w:p>
+            <w:pPr>
+              <w:jc w:val="center"/>
+            </w:pPr>
+          </w:p>
+        </w:tc>
+        <w:tc>
+          <w:tcPr>
+            <w:tcW w:w="1337" w:type="dxa"/>
+          </w:tcPr>
+          <w:p>
+            <w:pPr>
+              <w:jc w:val="center"/>
+            </w:pPr>
+          </w:p>
+        </w:tc>
+        <w:tc>
+          <w:tcPr>
+            <w:tcW w:w="1337" w:type="dxa"/>
+          </w:tcPr>
+          <w:p>
+            <w:pPr>
+              <w:jc w:val="center"/>
+            </w:pPr>
+          </w:p>
+        </w:tc>
+        <w:tc>
+          <w:tcPr>
+            <w:tcW w:w="1337" w:type="dxa"/>
+          </w:tcPr>
+          <w:p>
+            <w:pPr>
+              <w:jc w:val="center"/>
+            </w:pPr>
+          </w:p>
+        </w:tc>
+      </w:tr>
+      <w:tr>
+        <w:trPr>
+          <w:cantSplit/>
+          <w:jc w:val="center"/>
+        </w:trPr>
+        <w:tc>
+          <w:tcPr>
+            <w:tcW w:w="1337" w:type="dxa"/>
+          </w:tcPr>
+          <w:p>
+            <w:r>
+              <w:t>Male</w:t>
+            </w:r>
+          </w:p>
+        </w:tc>
+        <w:tc>
+          <w:tcPr>
+            <w:tcW w:w="1337" w:type="dxa"/>
+          </w:tcPr>
+          <w:p>
+            <w:pPr>
+              <w:jc w:val="center"/>
+            </w:pPr>
+            <w:r>
+              <w:t>2 ( 50.0)</w:t>
+            </w:r>
+          </w:p>
+        </w:tc>
+        <w:tc>
+          <w:tcPr>
+            <w:tcW w:w="1337" w:type="dxa"/>
+          </w:tcPr>
+          <w:p>
+            <w:pPr>
+              <w:jc w:val="center"/>
+            </w:pPr>
+            <w:r>
+              <w:t>1 ( 33.3)</w:t>
+            </w:r>
+          </w:p>
+        </w:tc>
+        <w:tc>
+          <w:tcPr>
+            <w:tcW w:w="1337" w:type="dxa"/>
+          </w:tcPr>
+          <w:p>
+            <w:pPr>
+              <w:jc w:val="center"/>
+            </w:pPr>
+            <w:r>
+              <w:t>1 ( 33.3)</w:t>
+            </w:r>
+          </w:p>
+        </w:tc>
+        <w:tc>
+          <w:tcPr>
+            <w:tcW w:w="1337" w:type="dxa"/>
+          </w:tcPr>
+          <w:p>
+            <w:pPr>
+              <w:jc w:val="center"/>
+            </w:pPr>
+            <w:r>
+              <w:t>7 ( 87.5)</w:t>
+            </w:r>
+          </w:p>
+        </w:tc>
+        <w:tc>
+          <w:tcPr>
+            <w:tcW w:w="1337" w:type="dxa"/>
+          </w:tcPr>
+          <w:p>
+            <w:pPr>
+              <w:jc w:val="center"/>
+            </w:pPr>
+            <w:r>
+              <w:t>8 ( 72.7)</w:t>
+            </w:r>
+          </w:p>
+        </w:tc>
+        <w:tc>
+          <w:tcPr>
+            <w:tcW w:w="1337" w:type="dxa"/>
+          </w:tcPr>
+          <w:p>
+            <w:pPr>
+              <w:jc w:val="center"/>
+            </w:pPr>
+            <w:r>
+              <w:t>11 ( 61.1)</w:t>
+            </w:r>
+          </w:p>
+        </w:tc>
+      </w:tr>
+      <w:tr>
+        <w:trPr>
+          <w:cantSplit/>
+          <w:jc w:val="center"/>
+        </w:trPr>
+        <w:tc>
+          <w:tcPr>
+            <w:tcW w:w="1337" w:type="dxa"/>
+          </w:tcPr>
+          <w:p>
+            <w:r>
+              <w:t>Female</w:t>
+            </w:r>
+          </w:p>
+        </w:tc>
+        <w:tc>
+          <w:tcPr>
+            <w:tcW w:w="1337" w:type="dxa"/>
+          </w:tcPr>
+          <w:p>
+            <w:pPr>
+              <w:jc w:val="center"/>
+            </w:pPr>
+            <w:r>
+              <w:t>2 ( 50.0)</w:t>
+            </w:r>
+          </w:p>
+        </w:tc>
+        <w:tc>
+          <w:tcPr>
+            <w:tcW w:w="1337" w:type="dxa"/>
+          </w:tcPr>
+          <w:p>
+            <w:pPr>
+              <w:jc w:val="center"/>
+            </w:pPr>
+            <w:r>
+              <w:t>2 ( 66.7)</w:t>
+            </w:r>
+          </w:p>
+        </w:tc>
+        <w:tc>
+          <w:tcPr>
+            <w:tcW w:w="1337" w:type="dxa"/>
+          </w:tcPr>
+          <w:p>
+            <w:pPr>
+              <w:jc w:val="center"/>
+            </w:pPr>
+            <w:r>
+              <w:t>2 ( 66.7)</w:t>
+            </w:r>
+          </w:p>
+        </w:tc>
+        <w:tc>
+          <w:tcPr>
+            <w:tcW w:w="1337" w:type="dxa"/>
+          </w:tcPr>
+          <w:p>
+            <w:pPr>
+              <w:jc w:val="center"/>
+            </w:pPr>
+            <w:r>
+              <w:t>1 ( 12.5)</w:t>
+            </w:r>
+          </w:p>
+        </w:tc>
+        <w:tc>
+          <w:tcPr>
+            <w:tcW w:w="1337" w:type="dxa"/>
+          </w:tcPr>
+          <w:p>
+            <w:pPr>
+              <w:jc w:val="center"/>
+            </w:pPr>
+            <w:r>
+              <w:t>3 ( 27.3)</w:t>
+            </w:r>
+          </w:p>
+        </w:tc>
+        <w:tc>
+          <w:tcPr>
+            <w:tcW w:w="1337" w:type="dxa"/>
+          </w:tcPr>
+          <w:p>
+            <w:pPr>
+              <w:jc w:val="center"/>
+            </w:pPr>
+            <w:r>
+              <w:t>7 ( 38.9)</w:t>
+            </w:r>
+          </w:p>
+        </w:tc>
+      </w:tr>
     </w:tbl>
     <w:p>
       <w:pPr>
         <w:pStyle w:val="C-InstructionText"/>
       </w:pPr>
       <w:r>
+        <w:t>Summary figures and tables</w:t>
+      </w:r>
+    </w:p>
+    <w:p>
+      <w:pPr>
+        <w:pStyle w:val="C-Heading2"/>
+      </w:pPr>
+      <w:bookmarkStart w:id="820" w:name="_Toc188472792"/>
+      <w:r>
+        <w:t>Efficacy Data</w:t>
+      </w:r>
+      <w:bookmarkEnd w:id="820"/>
+    </w:p>
+    <w:p>
+      <w:pPr>
+        <w:pStyle w:val="C-BodyText"/>
+      </w:pPr>
+    </w:p>
+    <w:p>
+      <w:pPr>
+        <w:pStyle w:val="C-InstructionText"/>
+      </w:pPr>
+      <w:r>
+        <w:t>Summary figures and tables</w:t>
+      </w:r>
+    </w:p>
+    <w:p>
+      <w:pPr>
+        <w:pStyle w:val="C-Heading2"/>
+      </w:pPr>
+      <w:bookmarkStart w:id="821" w:name="_Toc188472793"/>
+      <w:r>
+        <w:t>Safety Data</w:t>
+      </w:r>
+      <w:bookmarkEnd w:id="821"/>
+    </w:p>
+    <w:p>
+      <w:pPr>
+        <w:pStyle w:val="C-BodyText"/>
+      </w:pPr>
+    </w:p>
+    <w:p>
+      <w:pPr>
+        <w:pStyle w:val="C-InstructionText"/>
+      </w:pPr>
+      <w:r>
+        <w:t xml:space="preserve">Summary figures and tables </w:t>
+      </w:r>
+    </w:p>
+    <w:p>
+      <w:pPr>
+        <w:pStyle w:val="C-Heading3"/>
+      </w:pPr>
+      <w:bookmarkStart w:id="822" w:name="_Toc188472794"/>
+      <w:r>
+        <w:t>Displays of Adverse Events</w:t>
+      </w:r>
+      <w:bookmarkEnd w:id="822"/>
+      <w:r>
+        <w:t xml:space="preserve"> </w:t>
+      </w:r>
+    </w:p>
+    <w:p>
+      <w:pPr>
+        <w:pStyle w:val="C-BodyText"/>
+      </w:pPr>
+    </w:p>
+    <w:p>
+      <w:pPr>
+        <w:pStyle w:val="C-Heading3"/>
+      </w:pPr>
+      <w:bookmarkStart w:id="823" w:name="_Toc188472795"/>
+      <w:r>
+        <w:t>Listings of Deaths, Other Serious and Significant Adverse Events</w:t>
+      </w:r>
+      <w:bookmarkEnd w:id="823"/>
+      <w:r>
+        <w:t xml:space="preserve"> </w:t>
+      </w:r>
+    </w:p>
+    <w:p>
+      <w:pPr>
+        <w:pStyle w:val="C-BodyText"/>
+      </w:pPr>
+    </w:p>
+    <w:p>
+      <w:pPr>
+        <w:pStyle w:val="C-Heading3"/>
+      </w:pPr>
+      <w:bookmarkStart w:id="824" w:name="_Toc188472796"/>
+      <w:r>
         <w:lastRenderedPageBreak/>
-        <w:t>Summary figures and tables</w:t>
-      </w:r>
-    </w:p>
-    <w:p>
-      <w:pPr>
-        <w:pStyle w:val="C-Heading2"/>
-      </w:pPr>
-      <w:bookmarkStart w:id="820" w:name="_Toc188472792"/>
-      <w:r>
-        <w:t>Efficacy Data</w:t>
-      </w:r>
-      <w:bookmarkEnd w:id="820"/>
-    </w:p>
-    <w:p>
-      <w:pPr>
-        <w:pStyle w:val="C-BodyText"/>
-      </w:pPr>
-    </w:p>
-    <w:p>
-      <w:pPr>
-        <w:pStyle w:val="C-InstructionText"/>
-      </w:pPr>
-      <w:r>
-        <w:t>Summary figures and tables</w:t>
-      </w:r>
-    </w:p>
-    <w:p>
-      <w:pPr>
-        <w:pStyle w:val="C-Heading2"/>
-      </w:pPr>
-      <w:bookmarkStart w:id="821" w:name="_Toc188472793"/>
-      <w:r>
-        <w:t>Safety Data</w:t>
-      </w:r>
-      <w:bookmarkEnd w:id="821"/>
-    </w:p>
-    <w:p>
-      <w:pPr>
-        <w:pStyle w:val="C-BodyText"/>
-      </w:pPr>
-    </w:p>
-    <w:p>
-      <w:pPr>
-        <w:pStyle w:val="C-InstructionText"/>
-      </w:pPr>
-      <w:r>
-        <w:t xml:space="preserve">Summary figures and tables </w:t>
-      </w:r>
-    </w:p>
-    <w:p>
-      <w:pPr>
-        <w:pStyle w:val="C-Heading3"/>
-      </w:pPr>
-      <w:bookmarkStart w:id="822" w:name="_Toc188472794"/>
-      <w:r>
-        <w:t>Displays of Adverse Events</w:t>
-      </w:r>
-      <w:bookmarkEnd w:id="822"/>
-      <w:r>
-        <w:t xml:space="preserve"> </w:t>
-      </w:r>
-    </w:p>
-    <w:p>
-      <w:pPr>
-        <w:pStyle w:val="C-BodyText"/>
-      </w:pPr>
-    </w:p>
-    <w:p>
-      <w:pPr>
-        <w:pStyle w:val="C-Heading3"/>
-      </w:pPr>
-      <w:bookmarkStart w:id="823" w:name="_Toc188472795"/>
-      <w:r>
-        <w:t>Listings of Deaths, Other Serious and Significant Adverse Events</w:t>
-      </w:r>
-      <w:bookmarkEnd w:id="823"/>
-      <w:r>
-        <w:t xml:space="preserve"> </w:t>
-      </w:r>
-    </w:p>
-    <w:p>
-      <w:pPr>
-        <w:pStyle w:val="C-BodyText"/>
-      </w:pPr>
-    </w:p>
-    <w:p>
-      <w:pPr>
-        <w:pStyle w:val="C-Heading3"/>
-      </w:pPr>
-      <w:bookmarkStart w:id="824" w:name="_Toc188472796"/>
-      <w:r>
         <w:t>Narratives of Deaths, Other Serious and Certain Other Significant Adverse Events</w:t>
       </w:r>
       <w:bookmarkEnd w:id="824"/>
@@ -39937,6 +42040,7 @@
       <w:bookmarkStart w:id="887" w:name="_Toc188472809"/>
       <w:bookmarkStart w:id="888" w:name="_Hlk187949147"/>
       <w:r>
+        <w:lastRenderedPageBreak/>
         <w:t xml:space="preserve">Documentation </w:t>
       </w:r>
       <w:r>
@@ -40817,6 +42921,7 @@
         <w:pStyle w:val="C-InstructionText"/>
       </w:pPr>
       <w:r>
+        <w:lastRenderedPageBreak/>
         <w:t>All AEs for each subject, including the same event on several occasions, should be listed in this appendix, giving both the original term used by the investigator and the MedDRA preferred term (the MedDRA version must be included in the listing).</w:t>
       </w:r>
       <w:r>
@@ -50378,25 +52483,16 @@
 </file>
 
 <file path=customXml/item1.xml><?xml version="1.0" encoding="utf-8"?>
-<?mso-contentType ?>
-<FormTemplates xmlns="http://schemas.microsoft.com/sharepoint/v3/contenttype/forms">
-  <Display>DocumentLibraryForm</Display>
-  <Edit>DocumentLibraryForm</Edit>
-  <New>DocumentLibraryForm</New>
-</FormTemplates>
+<b:Sources xmlns:b="http://schemas.openxmlformats.org/officeDocument/2006/bibliography" xmlns="http://schemas.openxmlformats.org/officeDocument/2006/bibliography" SelectedStyle="\APASixthEditionOfficeOnline.xsl" StyleName="APA" Version="6"/>
 </file>
 
 <file path=customXml/item2.xml><?xml version="1.0" encoding="utf-8"?>
-<b:Sources xmlns:b="http://schemas.openxmlformats.org/officeDocument/2006/bibliography" xmlns="http://schemas.openxmlformats.org/officeDocument/2006/bibliography" SelectedStyle="\APASixthEditionOfficeOnline.xsl" StyleName="APA" Version="6"/>
-</file>
-
-<file path=customXml/item3.xml><?xml version="1.0" encoding="utf-8"?>
 <p:properties xmlns:p="http://schemas.microsoft.com/office/2006/metadata/properties" xmlns:xsi="http://www.w3.org/2001/XMLSchema-instance" xmlns:pc="http://schemas.microsoft.com/office/infopath/2007/PartnerControls">
   <documentManagement/>
 </p:properties>
 </file>
 
-<file path=customXml/item4.xml><?xml version="1.0" encoding="utf-8"?>
+<file path=customXml/item3.xml><?xml version="1.0" encoding="utf-8"?>
 <ct:contentTypeSchema xmlns:ct="http://schemas.microsoft.com/office/2006/metadata/contentType" xmlns:ma="http://schemas.microsoft.com/office/2006/metadata/properties/metaAttributes" ct:_="" ma:_="" ma:contentTypeName="Document" ma:contentTypeID="0x01010057D87FBAD0881240BA710960DA0EBF9B" ma:contentTypeVersion="12" ma:contentTypeDescription="Create a new document." ma:contentTypeScope="" ma:versionID="7017001b2d4ae4657081bea01c588d92">
   <xsd:schema xmlns:xsd="http://www.w3.org/2001/XMLSchema" xmlns:xs="http://www.w3.org/2001/XMLSchema" xmlns:p="http://schemas.microsoft.com/office/2006/metadata/properties" xmlns:ns2="77822f8c-87ba-4b1e-9999-5830109ee7ea" xmlns:ns3="3923d4b8-1dc1-4fa3-a327-a59d22ecd555" targetNamespace="http://schemas.microsoft.com/office/2006/metadata/properties" ma:root="true" ma:fieldsID="8d131df6861f6c0ffd52551130c426ac" ns2:_="" ns3:_="">
     <xsd:import namespace="77822f8c-87ba-4b1e-9999-5830109ee7ea"/>
@@ -50611,15 +52707,16 @@
 </ct:contentTypeSchema>
 </file>
 
-<file path=customXml/itemProps1.xml><?xml version="1.0" encoding="utf-8"?>
-<ds:datastoreItem xmlns:ds="http://schemas.openxmlformats.org/officeDocument/2006/customXml" ds:itemID="{0ACCD8EE-67E8-4FB3-A2E2-C1980DEB7929}">
-  <ds:schemaRefs>
-    <ds:schemaRef ds:uri="http://schemas.microsoft.com/sharepoint/v3/contenttype/forms"/>
-  </ds:schemaRefs>
-</ds:datastoreItem>
+<file path=customXml/item4.xml><?xml version="1.0" encoding="utf-8"?>
+<?mso-contentType ?>
+<FormTemplates xmlns="http://schemas.microsoft.com/sharepoint/v3/contenttype/forms">
+  <Display>DocumentLibraryForm</Display>
+  <Edit>DocumentLibraryForm</Edit>
+  <New>DocumentLibraryForm</New>
+</FormTemplates>
 </file>
 
-<file path=customXml/itemProps2.xml><?xml version="1.0" encoding="utf-8"?>
+<file path=customXml/itemProps1.xml><?xml version="1.0" encoding="utf-8"?>
 <ds:datastoreItem xmlns:ds="http://schemas.openxmlformats.org/officeDocument/2006/customXml" ds:itemID="{D3456F36-B7B8-46FF-8333-E10EDB3C0146}">
   <ds:schemaRefs>
     <ds:schemaRef ds:uri="http://schemas.openxmlformats.org/officeDocument/2006/bibliography"/>
@@ -50627,7 +52724,7 @@
 </ds:datastoreItem>
 </file>
 
-<file path=customXml/itemProps3.xml><?xml version="1.0" encoding="utf-8"?>
+<file path=customXml/itemProps2.xml><?xml version="1.0" encoding="utf-8"?>
 <ds:datastoreItem xmlns:ds="http://schemas.openxmlformats.org/officeDocument/2006/customXml" ds:itemID="{80BDBAA9-3891-49EB-89A8-3EA5F5026316}">
   <ds:schemaRefs>
     <ds:schemaRef ds:uri="http://schemas.microsoft.com/office/2006/metadata/properties"/>
@@ -50636,7 +52733,7 @@
 </ds:datastoreItem>
 </file>
 
-<file path=customXml/itemProps4.xml><?xml version="1.0" encoding="utf-8"?>
+<file path=customXml/itemProps3.xml><?xml version="1.0" encoding="utf-8"?>
 <ds:datastoreItem xmlns:ds="http://schemas.openxmlformats.org/officeDocument/2006/customXml" ds:itemID="{E60613BD-97D2-4246-B38C-E261D3ED04EA}">
   <ds:schemaRefs>
     <ds:schemaRef ds:uri="http://schemas.microsoft.com/office/2006/metadata/contentType"/>
@@ -50655,6 +52752,14 @@
 </ds:datastoreItem>
 </file>
 
+<file path=customXml/itemProps4.xml><?xml version="1.0" encoding="utf-8"?>
+<ds:datastoreItem xmlns:ds="http://schemas.openxmlformats.org/officeDocument/2006/customXml" ds:itemID="{0ACCD8EE-67E8-4FB3-A2E2-C1980DEB7929}">
+  <ds:schemaRefs>
+    <ds:schemaRef ds:uri="http://schemas.microsoft.com/sharepoint/v3/contenttype/forms"/>
+  </ds:schemaRefs>
+</ds:datastoreItem>
+</file>
+
 <file path=docMetadata/LabelInfo.xml><?xml version="1.0" encoding="utf-8"?>
 <clbl:labelList xmlns:clbl="http://schemas.microsoft.com/office/2020/mipLabelMetadata">
   <clbl:label id="{e0793d39-0939-496d-b129-198edd916feb}" enabled="0" method="" siteId="{e0793d39-0939-496d-b129-198edd916feb}" removed="1"/>

</xml_diff>